<commit_message>
Rewrite narcotic-tracking research around AI forecasting and anomaly alerts
Update part 1 with new hospital facts (orders already digital, pharmacist-written
narcotic form for FDA reporting), demote OCR, add pending assumptions. Rewrite
part 2 as a full topic proposal with title options, AI/software labels,
related work and questions for the advisor.

Co-Authored-By: Claude Sonnet 5.5 <noreply@anthropic.com>
</commit_message>
<xml_diff>
--- a/report/สอบหัวข้อโครงงาน.docx
+++ b/report/สอบหัวข้อโครงงาน.docx
@@ -139,23 +139,7 @@
           <w:rFonts w:hint="cs"/>
           <w:cs/>
         </w:rPr>
-        <w:t>ณ</w:t>
-      </w:r>
-      <w:proofErr w:type="spellStart"/>
-      <w:r>
-        <w:rPr>
-          <w:rFonts w:hint="cs"/>
-          <w:cs/>
-        </w:rPr>
-        <w:t>ิส</w:t>
-      </w:r>
-      <w:proofErr w:type="spellEnd"/>
-      <w:r>
-        <w:rPr>
-          <w:rFonts w:hint="cs"/>
-          <w:cs/>
-        </w:rPr>
-        <w:t>รานันท์</w:t>
+        <w:t>ณิสรานันท์</w:t>
       </w:r>
       <w:r>
         <w:rPr>
@@ -233,17 +217,8 @@
           <w:rFonts w:hint="cs"/>
           <w:cs/>
         </w:rPr>
-        <w:t>กณ</w:t>
-      </w:r>
-      <w:proofErr w:type="spellStart"/>
-      <w:r>
-        <w:rPr>
-          <w:rFonts w:hint="cs"/>
-          <w:cs/>
-        </w:rPr>
-        <w:t>วรรธน์</w:t>
-      </w:r>
-      <w:proofErr w:type="spellEnd"/>
+        <w:t>กณวรรธน์</w:t>
+      </w:r>
       <w:r>
         <w:rPr>
           <w:cs/>
@@ -319,16 +294,8 @@
         <w:rPr>
           <w:cs/>
         </w:rPr>
-        <w:t>คณะวิศวกรรมศาสตร์และเทคโนโลยี สถาบันการจัดการปัญญา</w:t>
-      </w:r>
-      <w:proofErr w:type="spellStart"/>
-      <w:r>
-        <w:rPr>
-          <w:cs/>
-        </w:rPr>
-        <w:t>ภิวัฒน์</w:t>
-      </w:r>
-      <w:proofErr w:type="spellEnd"/>
+        <w:t>คณะวิศวกรรมศาสตร์และเทคโนโลยี สถาบันการจัดการปัญญาภิวัฒน์</w:t>
+      </w:r>
     </w:p>
     <w:p>
       <w:pPr>
@@ -357,16 +324,8 @@
           <w:cs/>
         </w:rPr>
         <w:br/>
-        <w:t>ลิขสิทธิ์เป็นของสถาบันการจัดการปัญญา</w:t>
-      </w:r>
-      <w:proofErr w:type="spellStart"/>
-      <w:r>
-        <w:rPr>
-          <w:cs/>
-        </w:rPr>
-        <w:t>ภิวัฒน์</w:t>
-      </w:r>
-      <w:proofErr w:type="spellEnd"/>
+        <w:t>ลิขสิทธิ์เป็นของสถาบันการจัดการปัญญาภิวัฒน์</w:t>
+      </w:r>
     </w:p>
     <w:p>
       <w:pPr>
@@ -533,23 +492,7 @@
           <w:rFonts w:hint="cs"/>
           <w:cs/>
         </w:rPr>
-        <w:t>ณ</w:t>
-      </w:r>
-      <w:proofErr w:type="spellStart"/>
-      <w:r>
-        <w:rPr>
-          <w:rFonts w:hint="cs"/>
-          <w:cs/>
-        </w:rPr>
-        <w:t>ิส</w:t>
-      </w:r>
-      <w:proofErr w:type="spellEnd"/>
-      <w:r>
-        <w:rPr>
-          <w:rFonts w:hint="cs"/>
-          <w:cs/>
-        </w:rPr>
-        <w:t>รานันท์</w:t>
+        <w:t>ณิสรานันท์</w:t>
       </w:r>
       <w:r>
         <w:rPr>
@@ -627,17 +570,8 @@
           <w:rFonts w:hint="cs"/>
           <w:cs/>
         </w:rPr>
-        <w:t>กณ</w:t>
-      </w:r>
-      <w:proofErr w:type="spellStart"/>
-      <w:r>
-        <w:rPr>
-          <w:rFonts w:hint="cs"/>
-          <w:cs/>
-        </w:rPr>
-        <w:t>วรรธน์</w:t>
-      </w:r>
-      <w:proofErr w:type="spellEnd"/>
+        <w:t>กณวรรธน์</w:t>
+      </w:r>
       <w:r>
         <w:rPr>
           <w:cs/>
@@ -713,16 +647,8 @@
         <w:rPr>
           <w:cs/>
         </w:rPr>
-        <w:t>คณะวิศวกรรมศาสตร์และเทคโนโลยี สถาบันการจัดการปัญญา</w:t>
-      </w:r>
-      <w:proofErr w:type="spellStart"/>
-      <w:r>
-        <w:rPr>
-          <w:cs/>
-        </w:rPr>
-        <w:t>ภิวัฒน์</w:t>
-      </w:r>
-      <w:proofErr w:type="spellEnd"/>
+        <w:t>คณะวิศวกรรมศาสตร์และเทคโนโลยี สถาบันการจัดการปัญญาภิวัฒน์</w:t>
+      </w:r>
     </w:p>
     <w:p>
       <w:pPr>
@@ -751,16 +677,8 @@
           <w:cs/>
         </w:rPr>
         <w:br/>
-        <w:t>ลิขสิทธิ์เป็นของสถาบันการจัดการปัญญา</w:t>
-      </w:r>
-      <w:proofErr w:type="spellStart"/>
-      <w:r>
-        <w:rPr>
-          <w:cs/>
-        </w:rPr>
-        <w:t>ภิวัฒน์</w:t>
-      </w:r>
-      <w:proofErr w:type="spellEnd"/>
+        <w:t>ลิขสิทธิ์เป็นของสถาบันการจัดการปัญญาภิวัฒน์</w:t>
+      </w:r>
     </w:p>
     <w:p>
       <w:pPr>
@@ -894,19 +812,15 @@
         </w:rPr>
         <w:tab/>
       </w:r>
-      <w:proofErr w:type="spellStart"/>
       <w:r>
         <w:t>Nisaranun</w:t>
       </w:r>
-      <w:proofErr w:type="spellEnd"/>
-      <w:r>
-        <w:tab/>
-      </w:r>
-      <w:proofErr w:type="spellStart"/>
+      <w:r>
+        <w:tab/>
+      </w:r>
       <w:r>
         <w:t>Kunladechakkararoj</w:t>
       </w:r>
-      <w:proofErr w:type="spellEnd"/>
       <w:r>
         <w:tab/>
       </w:r>
@@ -973,13 +887,8 @@
       <w:pPr>
         <w:pStyle w:val="18"/>
       </w:pPr>
-      <w:proofErr w:type="gramStart"/>
-      <w:r>
-        <w:t>A  Senior</w:t>
-      </w:r>
-      <w:proofErr w:type="gramEnd"/>
-      <w:r>
-        <w:t xml:space="preserve"> Project Submitted in Partial Fulfillment of the Requirements</w:t>
+      <w:r>
+        <w:t>A  Senior Project Submitted in Partial Fulfillment of the Requirements</w:t>
       </w:r>
     </w:p>
     <w:p>
@@ -1011,15 +920,7 @@
         <w:pStyle w:val="18"/>
       </w:pPr>
       <w:r>
-        <w:t xml:space="preserve">Copyright of </w:t>
-      </w:r>
-      <w:proofErr w:type="spellStart"/>
-      <w:r>
-        <w:t>Panyapiwat</w:t>
-      </w:r>
-      <w:proofErr w:type="spellEnd"/>
-      <w:r>
-        <w:t xml:space="preserve"> Institute of Management</w:t>
+        <w:t>Copyright of Panyapiwat Institute of Management</w:t>
       </w:r>
     </w:p>
     <w:p>
@@ -1085,21 +986,7 @@
         <w:rPr>
           <w:cs/>
         </w:rPr>
-        <w:t>ณ</w:t>
-      </w:r>
-      <w:proofErr w:type="spellStart"/>
-      <w:r>
-        <w:rPr>
-          <w:cs/>
-        </w:rPr>
-        <w:t>ิส</w:t>
-      </w:r>
-      <w:proofErr w:type="spellEnd"/>
-      <w:r>
-        <w:rPr>
-          <w:cs/>
-        </w:rPr>
-        <w:t>รานันท์</w:t>
+        <w:t>ณิสรานันท์</w:t>
       </w:r>
       <w:r>
         <w:tab/>
@@ -1133,16 +1020,8 @@
         <w:rPr>
           <w:cs/>
         </w:rPr>
-        <w:t>กณ</w:t>
-      </w:r>
-      <w:proofErr w:type="spellStart"/>
-      <w:r>
-        <w:rPr>
-          <w:cs/>
-        </w:rPr>
-        <w:t>วรรธน์</w:t>
-      </w:r>
-      <w:proofErr w:type="spellEnd"/>
+        <w:t>กณวรรธน์</w:t>
+      </w:r>
       <w:r>
         <w:tab/>
       </w:r>
@@ -1373,18 +1252,8 @@
           <w:szCs w:val="32"/>
           <w:cs/>
         </w:rPr>
-        <w:t>คณะวิศวกรรมศาสตร์และเทคโนโลยี สถาบันการจัดการปัญญา</w:t>
-      </w:r>
-      <w:proofErr w:type="spellStart"/>
-      <w:r>
-        <w:rPr>
-          <w:rFonts w:ascii="TH SarabunPSK" w:hAnsi="TH SarabunPSK" w:cs="TH SarabunPSK" w:hint="cs"/>
-          <w:szCs w:val="32"/>
-          <w:cs/>
-        </w:rPr>
-        <w:t>ภิวัฒน์</w:t>
-      </w:r>
-      <w:proofErr w:type="spellEnd"/>
+        <w:t>คณะวิศวกรรมศาสตร์และเทคโนโลยี สถาบันการจัดการปัญญาภิวัฒน์</w:t>
+      </w:r>
     </w:p>
     <w:p>
       <w:pPr>
@@ -1894,21 +1763,7 @@
         <w:rPr>
           <w:cs/>
         </w:rPr>
-        <w:t>ณ</w:t>
-      </w:r>
-      <w:proofErr w:type="spellStart"/>
-      <w:r>
-        <w:rPr>
-          <w:cs/>
-        </w:rPr>
-        <w:t>ิส</w:t>
-      </w:r>
-      <w:proofErr w:type="spellEnd"/>
-      <w:r>
-        <w:rPr>
-          <w:cs/>
-        </w:rPr>
-        <w:t>รานันท์</w:t>
+        <w:t>ณิสรานันท์</w:t>
       </w:r>
       <w:r>
         <w:tab/>
@@ -1942,16 +1797,8 @@
         <w:rPr>
           <w:cs/>
         </w:rPr>
-        <w:t>กณ</w:t>
-      </w:r>
-      <w:proofErr w:type="spellStart"/>
-      <w:r>
-        <w:rPr>
-          <w:cs/>
-        </w:rPr>
-        <w:t>วรรธน์</w:t>
-      </w:r>
-      <w:proofErr w:type="spellEnd"/>
+        <w:t>กณวรรธน์</w:t>
+      </w:r>
       <w:r>
         <w:tab/>
       </w:r>
@@ -2176,7 +2023,6 @@
         <w:lastRenderedPageBreak/>
         <w:t>T</w:t>
       </w:r>
-      <w:proofErr w:type="spellStart"/>
       <w:r>
         <w:rPr>
           <w:b/>
@@ -2184,7 +2030,6 @@
         </w:rPr>
         <w:t>itle</w:t>
       </w:r>
-      <w:proofErr w:type="spellEnd"/>
     </w:p>
     <w:p>
       <w:pPr>
@@ -2226,28 +2071,24 @@
         </w:rPr>
         <w:tab/>
       </w:r>
-      <w:proofErr w:type="spellStart"/>
       <w:r>
         <w:rPr>
           <w:color w:val="000000"/>
         </w:rPr>
         <w:t>Nisaranun</w:t>
       </w:r>
-      <w:proofErr w:type="spellEnd"/>
       <w:r>
         <w:rPr>
           <w:color w:val="000000"/>
         </w:rPr>
         <w:tab/>
       </w:r>
-      <w:proofErr w:type="spellStart"/>
       <w:r>
         <w:rPr>
           <w:color w:val="000000"/>
         </w:rPr>
         <w:t>Kunladechakkararoj</w:t>
       </w:r>
-      <w:proofErr w:type="spellEnd"/>
     </w:p>
     <w:p>
       <w:pPr>
@@ -4448,7 +4289,6 @@
           <w:cs/>
         </w:rPr>
       </w:pPr>
-      <w:proofErr w:type="spellStart"/>
       <w:r>
         <w:rPr>
           <w:rFonts w:hint="cs"/>
@@ -4461,7 +4301,6 @@
         <w:lastRenderedPageBreak/>
         <w:t>สารบัญตาราง</w:t>
       </w:r>
-      <w:proofErr w:type="spellEnd"/>
     </w:p>
     <w:p>
       <w:pPr>
@@ -4597,6 +4436,9 @@
     <w:p>
       <w:pPr>
         <w:pStyle w:val="1"/>
+        <w:rPr>
+          <w:rFonts w:hint="cs"/>
+        </w:rPr>
       </w:pPr>
       <w:r>
         <w:lastRenderedPageBreak/>

</xml_diff>